<commit_message>
Profile: confirm CRM user roles/permissions admin; stop asking overqualification question. Fortive resume updated, score 73
Co-Authored-By: Claude Opus 5.5 <noreply@anthropic.com>
Claude-Session: https://claude.ai/code/session_01Quz1wQsVbycgj85WWSYfNT
</commit_message>
<xml_diff>
--- a/applications/fortive-servicechannel-platform-administrator/Rotenberg Resume - Fortive - Customer Platform Administrator.docx
+++ b/applications/fortive-servicechannel-platform-administrator/Rotenberg Resume - Fortive - Customer Platform Administrator.docx
@@ -177,7 +177,7 @@
           <w:i w:val="0"/>
           <w:color w:val="1A1A1A"/>
         </w:rPr>
-        <w:t>Configure and maintain CRM platforms in GoHighLevel and HubSpot for B2B service clients, including contact segmentation, lifecycle stages, pipelines, and strict data-hygiene rules.</w:t>
+        <w:t>Configure and maintain CRM platforms in GoHighLevel and HubSpot for B2B service clients, including user roles and permissions, contact segmentation, lifecycle stages, pipelines, and data-hygiene rules.</w:t>
       </w:r>
     </w:p>
     <w:p>
@@ -921,7 +921,7 @@
           <w:i w:val="0"/>
           <w:color w:val="1A1A1A"/>
         </w:rPr>
-        <w:t>Workflow Configuration, Dashboard Setup, CRM Architecture &amp; Data Hygiene, Configuration Documentation, Customer Change Requests, Troubleshooting &amp; Escalation</w:t>
+        <w:t>Workflow Configuration, User Access &amp; Permissions, Dashboard Setup, CRM Architecture &amp; Data Hygiene, Configuration Documentation, Customer Change Requests, Troubleshooting &amp; Escalation</w:t>
       </w:r>
     </w:p>
     <w:p>

</xml_diff>